<commit_message>
Remove appendix and footer from claim template
</commit_message>
<xml_diff>
--- a/app/modules/claims/claim_template.docx
+++ b/app/modules/claims/claim_template.docx
@@ -422,15 +422,6 @@
       </w:r>
     </w:p>
     <w:p>
-      <w:r>
-        <w:rPr>
-          <w:sz w:val="24"/>
-          <w:szCs w:val="24"/>
-        </w:rPr>
-        <w:t>Приложение: расчет задолженности.</w:t>
-      </w:r>
-    </w:p>
-    <w:p>
       <w:pPr>
         <w:spacing w:after="160"/>
       </w:pPr>
@@ -464,6 +455,8 @@
     </w:p>
     <w:sectPr>
       <w:footerReference w:type="default" r:id="rId7"/>
+      <w:footerReference w:type="first" r:id="rId10"/>
+      <w:footerReference w:type="even" r:id="rId11"/>
       <w:pgSz w:w="11906" w:h="16838"/>
       <w:pgMar w:top="1440" w:right="1440" w:bottom="1440" w:left="1440" w:header="708" w:footer="708" w:gutter="0"/>
       <w:cols w:space="720"/>
@@ -498,14 +491,29 @@
     <w:pPr>
       <w:jc w:val="center"/>
     </w:pPr>
-    <w:r>
-      <w:rPr>
-        <w:color w:val="6B7280"/>
-        <w:sz w:val="18"/>
-        <w:szCs w:val="18"/>
-      </w:rPr>
-      <w:t>ООО "УК «Жилищник»" · ОГРН 1077746269810 · ИНН 7732512948 · КПП 772901001</w:t>
-    </w:r>
+    <w:r/>
+  </w:p>
+</w:ftr>
+</file>
+
+<file path=word/footer2.xml><?xml version="1.0" encoding="utf-8"?>
+<w:ftr xmlns:m="http://schemas.openxmlformats.org/officeDocument/2006/math" xmlns:mc="http://schemas.openxmlformats.org/markup-compatibility/2006" xmlns:mo="http://schemas.microsoft.com/office/mac/office/2008/main" xmlns:mv="urn:schemas-microsoft-com:mac:vml" xmlns:o="urn:schemas-microsoft-com:office:office" xmlns:r="http://schemas.openxmlformats.org/officeDocument/2006/relationships" xmlns:v="urn:schemas-microsoft-com:vml" xmlns:w10="urn:schemas-microsoft-com:office:word" xmlns:w14="http://schemas.microsoft.com/office/word/2010/wordml" xmlns:w="http://schemas.openxmlformats.org/wordprocessingml/2006/main" xmlns:wne="http://schemas.microsoft.com/office/word/2006/wordml" xmlns:wp14="http://schemas.microsoft.com/office/word/2010/wordprocessingDrawing" xmlns:wp="http://schemas.openxmlformats.org/drawingml/2006/wordprocessingDrawing" xmlns:wpc="http://schemas.microsoft.com/office/word/2010/wordprocessingCanvas" xmlns:wpg="http://schemas.microsoft.com/office/word/2010/wordprocessingGroup" xmlns:wpi="http://schemas.microsoft.com/office/word/2010/wordprocessingInk" xmlns:wps="http://schemas.microsoft.com/office/word/2010/wordprocessingShape" mc:Ignorable="w14 wp14">
+  <w:p>
+    <w:pPr>
+      <w:pStyle w:val="Footer"/>
+    </w:pPr>
+    <w:r/>
+  </w:p>
+</w:ftr>
+</file>
+
+<file path=word/footer3.xml><?xml version="1.0" encoding="utf-8"?>
+<w:ftr xmlns:m="http://schemas.openxmlformats.org/officeDocument/2006/math" xmlns:mc="http://schemas.openxmlformats.org/markup-compatibility/2006" xmlns:mo="http://schemas.microsoft.com/office/mac/office/2008/main" xmlns:mv="urn:schemas-microsoft-com:mac:vml" xmlns:o="urn:schemas-microsoft-com:office:office" xmlns:r="http://schemas.openxmlformats.org/officeDocument/2006/relationships" xmlns:v="urn:schemas-microsoft-com:vml" xmlns:w10="urn:schemas-microsoft-com:office:word" xmlns:w14="http://schemas.microsoft.com/office/word/2010/wordml" xmlns:w="http://schemas.openxmlformats.org/wordprocessingml/2006/main" xmlns:wne="http://schemas.microsoft.com/office/word/2006/wordml" xmlns:wp14="http://schemas.microsoft.com/office/word/2010/wordprocessingDrawing" xmlns:wp="http://schemas.openxmlformats.org/drawingml/2006/wordprocessingDrawing" xmlns:wpc="http://schemas.microsoft.com/office/word/2010/wordprocessingCanvas" xmlns:wpg="http://schemas.microsoft.com/office/word/2010/wordprocessingGroup" xmlns:wpi="http://schemas.microsoft.com/office/word/2010/wordprocessingInk" xmlns:wps="http://schemas.microsoft.com/office/word/2010/wordprocessingShape" mc:Ignorable="w14 wp14">
+  <w:p>
+    <w:pPr>
+      <w:pStyle w:val="Footer"/>
+    </w:pPr>
+    <w:r/>
   </w:p>
 </w:ftr>
 </file>

</xml_diff>